<commit_message>
Contract 26-UNI-010: prices without VAT (supplier is not a VAT payer)
Co-Authored-By: Claude Opus 5.5 <noreply@anthropic.com>
Claude-Session: https://claude.ai/code/session_019XvBcJkEMDJU2na6bQmQcP
</commit_message>
<xml_diff>
--- a/Договор_26-UNI-010_RAMAZANOVA_ELEKTRON_MONITORING.docx
+++ b/Договор_26-UNI-010_RAMAZANOVA_ELEKTRON_MONITORING.docx
@@ -210,15 +210,12 @@
         </w:tblCellMar>
       </w:tblPr>
       <w:tblGrid>
-        <w:gridCol w:w="450"/>
-        <w:gridCol w:w="1705"/>
-        <w:gridCol w:w="650"/>
-        <w:gridCol w:w="750"/>
-        <w:gridCol w:w="1250"/>
-        <w:gridCol w:w="1400"/>
-        <w:gridCol w:w="900"/>
-        <w:gridCol w:w="1100"/>
+        <w:gridCol w:w="600"/>
+        <w:gridCol w:w="3505"/>
+        <w:gridCol w:w="1000"/>
         <w:gridCol w:w="1150"/>
+        <w:gridCol w:w="1450"/>
+        <w:gridCol w:w="1650"/>
       </w:tblGrid>
       <w:tr>
         <w:trPr>
@@ -226,7 +223,7 @@
         </w:trPr>
         <w:tc>
           <w:tcPr>
-            <w:tcW w:w="450" w:type="dxa"/>
+            <w:tcW w:w="600" w:type="dxa"/>
             <w:shd w:val="clear" w:color="auto" w:fill="E7E6E6"/>
             <w:vAlign w:val="center"/>
           </w:tcPr>
@@ -250,7 +247,7 @@
         </w:tc>
         <w:tc>
           <w:tcPr>
-            <w:tcW w:w="1705" w:type="dxa"/>
+            <w:tcW w:w="3505" w:type="dxa"/>
             <w:shd w:val="clear" w:color="auto" w:fill="E7E6E6"/>
             <w:vAlign w:val="center"/>
           </w:tcPr>
@@ -274,7 +271,7 @@
         </w:tc>
         <w:tc>
           <w:tcPr>
-            <w:tcW w:w="650" w:type="dxa"/>
+            <w:tcW w:w="1000" w:type="dxa"/>
             <w:shd w:val="clear" w:color="auto" w:fill="E7E6E6"/>
             <w:vAlign w:val="center"/>
           </w:tcPr>
@@ -298,7 +295,7 @@
         </w:tc>
         <w:tc>
           <w:tcPr>
-            <w:tcW w:w="750" w:type="dxa"/>
+            <w:tcW w:w="1150" w:type="dxa"/>
             <w:shd w:val="clear" w:color="auto" w:fill="E7E6E6"/>
             <w:vAlign w:val="center"/>
           </w:tcPr>
@@ -322,7 +319,7 @@
         </w:tc>
         <w:tc>
           <w:tcPr>
-            <w:tcW w:w="1250" w:type="dxa"/>
+            <w:tcW w:w="1450" w:type="dxa"/>
             <w:shd w:val="clear" w:color="auto" w:fill="E7E6E6"/>
             <w:vAlign w:val="center"/>
           </w:tcPr>
@@ -340,13 +337,13 @@
                 <w:szCs w:val="20"/>
                 <w:lang w:eastAsia="ru-RU"/>
               </w:rPr>
-              <w:t xml:space="preserve">Цена за ед., сум</w:t>
+              <w:t xml:space="preserve">Цена за ед., сум (без НДС)</w:t>
             </w:r>
           </w:p>
         </w:tc>
         <w:tc>
           <w:tcPr>
-            <w:tcW w:w="1400" w:type="dxa"/>
+            <w:tcW w:w="1650" w:type="dxa"/>
             <w:shd w:val="clear" w:color="auto" w:fill="E7E6E6"/>
             <w:vAlign w:val="center"/>
           </w:tcPr>
@@ -364,79 +361,7 @@
                 <w:szCs w:val="20"/>
                 <w:lang w:eastAsia="ru-RU"/>
               </w:rPr>
-              <w:t xml:space="preserve">Стоимость поставки, сум</w:t>
-            </w:r>
-          </w:p>
-        </w:tc>
-        <w:tc>
-          <w:tcPr>
-            <w:tcW w:w="900" w:type="dxa"/>
-            <w:shd w:val="clear" w:color="auto" w:fill="E7E6E6"/>
-            <w:vAlign w:val="center"/>
-          </w:tcPr>
-          <w:p>
-            <w:pPr>
-              <w:spacing w:before="20" w:after="20" w:line="240" w:lineRule="auto"/>
-              <w:jc w:val="center"/>
-            </w:pPr>
-            <w:r>
-              <w:rPr>
-                <w:rFonts w:ascii="Times New Roman" w:eastAsia="Times New Roman" w:hAnsi="Times New Roman" w:cs="Times New Roman"/>
-                <w:b/>
-                <w:bCs/>
-                <w:sz w:val="20"/>
-                <w:szCs w:val="20"/>
-                <w:lang w:eastAsia="ru-RU"/>
-              </w:rPr>
-              <w:t xml:space="preserve">Ставка НДС</w:t>
-            </w:r>
-          </w:p>
-        </w:tc>
-        <w:tc>
-          <w:tcPr>
-            <w:tcW w:w="1100" w:type="dxa"/>
-            <w:shd w:val="clear" w:color="auto" w:fill="E7E6E6"/>
-            <w:vAlign w:val="center"/>
-          </w:tcPr>
-          <w:p>
-            <w:pPr>
-              <w:spacing w:before="20" w:after="20" w:line="240" w:lineRule="auto"/>
-              <w:jc w:val="center"/>
-            </w:pPr>
-            <w:r>
-              <w:rPr>
-                <w:rFonts w:ascii="Times New Roman" w:eastAsia="Times New Roman" w:hAnsi="Times New Roman" w:cs="Times New Roman"/>
-                <w:b/>
-                <w:bCs/>
-                <w:sz w:val="20"/>
-                <w:szCs w:val="20"/>
-                <w:lang w:eastAsia="ru-RU"/>
-              </w:rPr>
-              <w:t xml:space="preserve">НДС, сумма, сум</w:t>
-            </w:r>
-          </w:p>
-        </w:tc>
-        <w:tc>
-          <w:tcPr>
-            <w:tcW w:w="1150" w:type="dxa"/>
-            <w:shd w:val="clear" w:color="auto" w:fill="E7E6E6"/>
-            <w:vAlign w:val="center"/>
-          </w:tcPr>
-          <w:p>
-            <w:pPr>
-              <w:spacing w:before="20" w:after="20" w:line="240" w:lineRule="auto"/>
-              <w:jc w:val="center"/>
-            </w:pPr>
-            <w:r>
-              <w:rPr>
-                <w:rFonts w:ascii="Times New Roman" w:eastAsia="Times New Roman" w:hAnsi="Times New Roman" w:cs="Times New Roman"/>
-                <w:b/>
-                <w:bCs/>
-                <w:sz w:val="20"/>
-                <w:szCs w:val="20"/>
-                <w:lang w:eastAsia="ru-RU"/>
-              </w:rPr>
-              <w:t xml:space="preserve">Стоимость с НДС, сум</w:t>
+              <w:t xml:space="preserve">Стоимость, сум (без НДС)</w:t>
             </w:r>
           </w:p>
         </w:tc>
@@ -444,7 +369,7 @@
       <w:tr>
         <w:tc>
           <w:tcPr>
-            <w:tcW w:w="450" w:type="dxa"/>
+            <w:tcW w:w="600" w:type="dxa"/>
             <w:vAlign w:val="center"/>
           </w:tcPr>
           <w:p>
@@ -465,7 +390,7 @@
         </w:tc>
         <w:tc>
           <w:tcPr>
-            <w:tcW w:w="1705" w:type="dxa"/>
+            <w:tcW w:w="3505" w:type="dxa"/>
             <w:vAlign w:val="center"/>
           </w:tcPr>
           <w:p>
@@ -486,7 +411,7 @@
         </w:tc>
         <w:tc>
           <w:tcPr>
-            <w:tcW w:w="650" w:type="dxa"/>
+            <w:tcW w:w="1000" w:type="dxa"/>
             <w:vAlign w:val="center"/>
           </w:tcPr>
           <w:p>
@@ -507,7 +432,7 @@
         </w:tc>
         <w:tc>
           <w:tcPr>
-            <w:tcW w:w="750" w:type="dxa"/>
+            <w:tcW w:w="1150" w:type="dxa"/>
             <w:vAlign w:val="center"/>
           </w:tcPr>
           <w:p>
@@ -528,7 +453,7 @@
         </w:tc>
         <w:tc>
           <w:tcPr>
-            <w:tcW w:w="1250" w:type="dxa"/>
+            <w:tcW w:w="1450" w:type="dxa"/>
             <w:vAlign w:val="center"/>
           </w:tcPr>
           <w:p>
@@ -549,7 +474,7 @@
         </w:tc>
         <w:tc>
           <w:tcPr>
-            <w:tcW w:w="1400" w:type="dxa"/>
+            <w:tcW w:w="1650" w:type="dxa"/>
             <w:vAlign w:val="center"/>
           </w:tcPr>
           <w:p>
@@ -568,74 +493,11 @@
             </w:r>
           </w:p>
         </w:tc>
-        <w:tc>
-          <w:tcPr>
-            <w:tcW w:w="900" w:type="dxa"/>
-            <w:vAlign w:val="center"/>
-          </w:tcPr>
-          <w:p>
-            <w:pPr>
-              <w:spacing w:before="20" w:after="20" w:line="240" w:lineRule="auto"/>
-              <w:jc w:val="center"/>
-            </w:pPr>
-            <w:r>
-              <w:rPr>
-                <w:rFonts w:ascii="Times New Roman" w:eastAsia="Times New Roman" w:hAnsi="Times New Roman" w:cs="Times New Roman"/>
-                <w:sz w:val="20"/>
-                <w:szCs w:val="20"/>
-                <w:lang w:eastAsia="ru-RU"/>
-              </w:rPr>
-              <w:t xml:space="preserve">12%</w:t>
-            </w:r>
-          </w:p>
-        </w:tc>
-        <w:tc>
-          <w:tcPr>
-            <w:tcW w:w="1100" w:type="dxa"/>
-            <w:vAlign w:val="center"/>
-          </w:tcPr>
-          <w:p>
-            <w:pPr>
-              <w:spacing w:before="20" w:after="20" w:line="240" w:lineRule="auto"/>
-              <w:jc w:val="right"/>
-            </w:pPr>
-            <w:r>
-              <w:rPr>
-                <w:rFonts w:ascii="Times New Roman" w:eastAsia="Times New Roman" w:hAnsi="Times New Roman" w:cs="Times New Roman"/>
-                <w:sz w:val="20"/>
-                <w:szCs w:val="20"/>
-                <w:lang w:eastAsia="ru-RU"/>
-              </w:rPr>
-              <w:t xml:space="preserve">3 240 000</w:t>
-            </w:r>
-          </w:p>
-        </w:tc>
-        <w:tc>
-          <w:tcPr>
-            <w:tcW w:w="1150" w:type="dxa"/>
-            <w:vAlign w:val="center"/>
-          </w:tcPr>
-          <w:p>
-            <w:pPr>
-              <w:spacing w:before="20" w:after="20" w:line="240" w:lineRule="auto"/>
-              <w:jc w:val="right"/>
-            </w:pPr>
-            <w:r>
-              <w:rPr>
-                <w:rFonts w:ascii="Times New Roman" w:eastAsia="Times New Roman" w:hAnsi="Times New Roman" w:cs="Times New Roman"/>
-                <w:sz w:val="20"/>
-                <w:szCs w:val="20"/>
-                <w:lang w:eastAsia="ru-RU"/>
-              </w:rPr>
-              <w:t xml:space="preserve">30 240 000</w:t>
-            </w:r>
-          </w:p>
-        </w:tc>
       </w:tr>
       <w:tr>
         <w:tc>
           <w:tcPr>
-            <w:tcW w:w="450" w:type="dxa"/>
+            <w:tcW w:w="600" w:type="dxa"/>
             <w:vAlign w:val="center"/>
           </w:tcPr>
           <w:p>
@@ -656,7 +518,7 @@
         </w:tc>
         <w:tc>
           <w:tcPr>
-            <w:tcW w:w="1705" w:type="dxa"/>
+            <w:tcW w:w="3505" w:type="dxa"/>
             <w:vAlign w:val="center"/>
           </w:tcPr>
           <w:p>
@@ -677,7 +539,7 @@
         </w:tc>
         <w:tc>
           <w:tcPr>
-            <w:tcW w:w="650" w:type="dxa"/>
+            <w:tcW w:w="1000" w:type="dxa"/>
             <w:vAlign w:val="center"/>
           </w:tcPr>
           <w:p>
@@ -698,7 +560,7 @@
         </w:tc>
         <w:tc>
           <w:tcPr>
-            <w:tcW w:w="750" w:type="dxa"/>
+            <w:tcW w:w="1150" w:type="dxa"/>
             <w:vAlign w:val="center"/>
           </w:tcPr>
           <w:p>
@@ -719,7 +581,7 @@
         </w:tc>
         <w:tc>
           <w:tcPr>
-            <w:tcW w:w="1250" w:type="dxa"/>
+            <w:tcW w:w="1450" w:type="dxa"/>
             <w:vAlign w:val="center"/>
           </w:tcPr>
           <w:p>
@@ -740,7 +602,7 @@
         </w:tc>
         <w:tc>
           <w:tcPr>
-            <w:tcW w:w="1400" w:type="dxa"/>
+            <w:tcW w:w="1650" w:type="dxa"/>
             <w:vAlign w:val="center"/>
           </w:tcPr>
           <w:p>
@@ -759,74 +621,11 @@
             </w:r>
           </w:p>
         </w:tc>
-        <w:tc>
-          <w:tcPr>
-            <w:tcW w:w="900" w:type="dxa"/>
-            <w:vAlign w:val="center"/>
-          </w:tcPr>
-          <w:p>
-            <w:pPr>
-              <w:spacing w:before="20" w:after="20" w:line="240" w:lineRule="auto"/>
-              <w:jc w:val="center"/>
-            </w:pPr>
-            <w:r>
-              <w:rPr>
-                <w:rFonts w:ascii="Times New Roman" w:eastAsia="Times New Roman" w:hAnsi="Times New Roman" w:cs="Times New Roman"/>
-                <w:sz w:val="20"/>
-                <w:szCs w:val="20"/>
-                <w:lang w:eastAsia="ru-RU"/>
-              </w:rPr>
-              <w:t xml:space="preserve">12%</w:t>
-            </w:r>
-          </w:p>
-        </w:tc>
-        <w:tc>
-          <w:tcPr>
-            <w:tcW w:w="1100" w:type="dxa"/>
-            <w:vAlign w:val="center"/>
-          </w:tcPr>
-          <w:p>
-            <w:pPr>
-              <w:spacing w:before="20" w:after="20" w:line="240" w:lineRule="auto"/>
-              <w:jc w:val="right"/>
-            </w:pPr>
-            <w:r>
-              <w:rPr>
-                <w:rFonts w:ascii="Times New Roman" w:eastAsia="Times New Roman" w:hAnsi="Times New Roman" w:cs="Times New Roman"/>
-                <w:sz w:val="20"/>
-                <w:szCs w:val="20"/>
-                <w:lang w:eastAsia="ru-RU"/>
-              </w:rPr>
-              <w:t xml:space="preserve">1 800 000</w:t>
-            </w:r>
-          </w:p>
-        </w:tc>
-        <w:tc>
-          <w:tcPr>
-            <w:tcW w:w="1150" w:type="dxa"/>
-            <w:vAlign w:val="center"/>
-          </w:tcPr>
-          <w:p>
-            <w:pPr>
-              <w:spacing w:before="20" w:after="20" w:line="240" w:lineRule="auto"/>
-              <w:jc w:val="right"/>
-            </w:pPr>
-            <w:r>
-              <w:rPr>
-                <w:rFonts w:ascii="Times New Roman" w:eastAsia="Times New Roman" w:hAnsi="Times New Roman" w:cs="Times New Roman"/>
-                <w:sz w:val="20"/>
-                <w:szCs w:val="20"/>
-                <w:lang w:eastAsia="ru-RU"/>
-              </w:rPr>
-              <w:t xml:space="preserve">16 800 000</w:t>
-            </w:r>
-          </w:p>
-        </w:tc>
       </w:tr>
       <w:tr>
         <w:tc>
           <w:tcPr>
-            <w:tcW w:w="450" w:type="dxa"/>
+            <w:tcW w:w="600" w:type="dxa"/>
             <w:vAlign w:val="center"/>
           </w:tcPr>
           <w:p>
@@ -847,7 +646,7 @@
         </w:tc>
         <w:tc>
           <w:tcPr>
-            <w:tcW w:w="1705" w:type="dxa"/>
+            <w:tcW w:w="3505" w:type="dxa"/>
             <w:vAlign w:val="center"/>
           </w:tcPr>
           <w:p>
@@ -868,7 +667,7 @@
         </w:tc>
         <w:tc>
           <w:tcPr>
-            <w:tcW w:w="650" w:type="dxa"/>
+            <w:tcW w:w="1000" w:type="dxa"/>
             <w:vAlign w:val="center"/>
           </w:tcPr>
           <w:p>
@@ -889,7 +688,7 @@
         </w:tc>
         <w:tc>
           <w:tcPr>
-            <w:tcW w:w="750" w:type="dxa"/>
+            <w:tcW w:w="1150" w:type="dxa"/>
             <w:vAlign w:val="center"/>
           </w:tcPr>
           <w:p>
@@ -910,7 +709,7 @@
         </w:tc>
         <w:tc>
           <w:tcPr>
-            <w:tcW w:w="1250" w:type="dxa"/>
+            <w:tcW w:w="1450" w:type="dxa"/>
             <w:vAlign w:val="center"/>
           </w:tcPr>
           <w:p>
@@ -931,7 +730,7 @@
         </w:tc>
         <w:tc>
           <w:tcPr>
-            <w:tcW w:w="1400" w:type="dxa"/>
+            <w:tcW w:w="1650" w:type="dxa"/>
             <w:vAlign w:val="center"/>
           </w:tcPr>
           <w:p>
@@ -950,74 +749,11 @@
             </w:r>
           </w:p>
         </w:tc>
-        <w:tc>
-          <w:tcPr>
-            <w:tcW w:w="900" w:type="dxa"/>
-            <w:vAlign w:val="center"/>
-          </w:tcPr>
-          <w:p>
-            <w:pPr>
-              <w:spacing w:before="20" w:after="20" w:line="240" w:lineRule="auto"/>
-              <w:jc w:val="center"/>
-            </w:pPr>
-            <w:r>
-              <w:rPr>
-                <w:rFonts w:ascii="Times New Roman" w:eastAsia="Times New Roman" w:hAnsi="Times New Roman" w:cs="Times New Roman"/>
-                <w:sz w:val="20"/>
-                <w:szCs w:val="20"/>
-                <w:lang w:eastAsia="ru-RU"/>
-              </w:rPr>
-              <w:t xml:space="preserve">12%</w:t>
-            </w:r>
-          </w:p>
-        </w:tc>
-        <w:tc>
-          <w:tcPr>
-            <w:tcW w:w="1100" w:type="dxa"/>
-            <w:vAlign w:val="center"/>
-          </w:tcPr>
-          <w:p>
-            <w:pPr>
-              <w:spacing w:before="20" w:after="20" w:line="240" w:lineRule="auto"/>
-              <w:jc w:val="right"/>
-            </w:pPr>
-            <w:r>
-              <w:rPr>
-                <w:rFonts w:ascii="Times New Roman" w:eastAsia="Times New Roman" w:hAnsi="Times New Roman" w:cs="Times New Roman"/>
-                <w:sz w:val="20"/>
-                <w:szCs w:val="20"/>
-                <w:lang w:eastAsia="ru-RU"/>
-              </w:rPr>
-              <w:t xml:space="preserve">2 820 000</w:t>
-            </w:r>
-          </w:p>
-        </w:tc>
-        <w:tc>
-          <w:tcPr>
-            <w:tcW w:w="1150" w:type="dxa"/>
-            <w:vAlign w:val="center"/>
-          </w:tcPr>
-          <w:p>
-            <w:pPr>
-              <w:spacing w:before="20" w:after="20" w:line="240" w:lineRule="auto"/>
-              <w:jc w:val="right"/>
-            </w:pPr>
-            <w:r>
-              <w:rPr>
-                <w:rFonts w:ascii="Times New Roman" w:eastAsia="Times New Roman" w:hAnsi="Times New Roman" w:cs="Times New Roman"/>
-                <w:sz w:val="20"/>
-                <w:szCs w:val="20"/>
-                <w:lang w:eastAsia="ru-RU"/>
-              </w:rPr>
-              <w:t xml:space="preserve">26 320 000</w:t>
-            </w:r>
-          </w:p>
-        </w:tc>
       </w:tr>
       <w:tr>
         <w:tc>
           <w:tcPr>
-            <w:tcW w:w="450" w:type="dxa"/>
+            <w:tcW w:w="600" w:type="dxa"/>
             <w:vAlign w:val="center"/>
           </w:tcPr>
           <w:p>
@@ -1038,7 +774,7 @@
         </w:tc>
         <w:tc>
           <w:tcPr>
-            <w:tcW w:w="1705" w:type="dxa"/>
+            <w:tcW w:w="3505" w:type="dxa"/>
             <w:vAlign w:val="center"/>
           </w:tcPr>
           <w:p>
@@ -1059,7 +795,7 @@
         </w:tc>
         <w:tc>
           <w:tcPr>
-            <w:tcW w:w="650" w:type="dxa"/>
+            <w:tcW w:w="1000" w:type="dxa"/>
             <w:vAlign w:val="center"/>
           </w:tcPr>
           <w:p>
@@ -1080,7 +816,7 @@
         </w:tc>
         <w:tc>
           <w:tcPr>
-            <w:tcW w:w="750" w:type="dxa"/>
+            <w:tcW w:w="1150" w:type="dxa"/>
             <w:vAlign w:val="center"/>
           </w:tcPr>
           <w:p>
@@ -1101,7 +837,7 @@
         </w:tc>
         <w:tc>
           <w:tcPr>
-            <w:tcW w:w="1250" w:type="dxa"/>
+            <w:tcW w:w="1450" w:type="dxa"/>
             <w:vAlign w:val="center"/>
           </w:tcPr>
           <w:p>
@@ -1122,7 +858,7 @@
         </w:tc>
         <w:tc>
           <w:tcPr>
-            <w:tcW w:w="1400" w:type="dxa"/>
+            <w:tcW w:w="1650" w:type="dxa"/>
             <w:vAlign w:val="center"/>
           </w:tcPr>
           <w:p>
@@ -1141,74 +877,11 @@
             </w:r>
           </w:p>
         </w:tc>
-        <w:tc>
-          <w:tcPr>
-            <w:tcW w:w="900" w:type="dxa"/>
-            <w:vAlign w:val="center"/>
-          </w:tcPr>
-          <w:p>
-            <w:pPr>
-              <w:spacing w:before="20" w:after="20" w:line="240" w:lineRule="auto"/>
-              <w:jc w:val="center"/>
-            </w:pPr>
-            <w:r>
-              <w:rPr>
-                <w:rFonts w:ascii="Times New Roman" w:eastAsia="Times New Roman" w:hAnsi="Times New Roman" w:cs="Times New Roman"/>
-                <w:sz w:val="20"/>
-                <w:szCs w:val="20"/>
-                <w:lang w:eastAsia="ru-RU"/>
-              </w:rPr>
-              <w:t xml:space="preserve">12%</w:t>
-            </w:r>
-          </w:p>
-        </w:tc>
-        <w:tc>
-          <w:tcPr>
-            <w:tcW w:w="1100" w:type="dxa"/>
-            <w:vAlign w:val="center"/>
-          </w:tcPr>
-          <w:p>
-            <w:pPr>
-              <w:spacing w:before="20" w:after="20" w:line="240" w:lineRule="auto"/>
-              <w:jc w:val="right"/>
-            </w:pPr>
-            <w:r>
-              <w:rPr>
-                <w:rFonts w:ascii="Times New Roman" w:eastAsia="Times New Roman" w:hAnsi="Times New Roman" w:cs="Times New Roman"/>
-                <w:sz w:val="20"/>
-                <w:szCs w:val="20"/>
-                <w:lang w:eastAsia="ru-RU"/>
-              </w:rPr>
-              <w:t xml:space="preserve">456 000</w:t>
-            </w:r>
-          </w:p>
-        </w:tc>
-        <w:tc>
-          <w:tcPr>
-            <w:tcW w:w="1150" w:type="dxa"/>
-            <w:vAlign w:val="center"/>
-          </w:tcPr>
-          <w:p>
-            <w:pPr>
-              <w:spacing w:before="20" w:after="20" w:line="240" w:lineRule="auto"/>
-              <w:jc w:val="right"/>
-            </w:pPr>
-            <w:r>
-              <w:rPr>
-                <w:rFonts w:ascii="Times New Roman" w:eastAsia="Times New Roman" w:hAnsi="Times New Roman" w:cs="Times New Roman"/>
-                <w:sz w:val="20"/>
-                <w:szCs w:val="20"/>
-                <w:lang w:eastAsia="ru-RU"/>
-              </w:rPr>
-              <w:t xml:space="preserve">4 256 000</w:t>
-            </w:r>
-          </w:p>
-        </w:tc>
       </w:tr>
       <w:tr>
         <w:tc>
           <w:tcPr>
-            <w:tcW w:w="450" w:type="dxa"/>
+            <w:tcW w:w="600" w:type="dxa"/>
             <w:vAlign w:val="center"/>
           </w:tcPr>
           <w:p>
@@ -1231,7 +904,7 @@
         </w:tc>
         <w:tc>
           <w:tcPr>
-            <w:tcW w:w="1705" w:type="dxa"/>
+            <w:tcW w:w="3505" w:type="dxa"/>
             <w:vAlign w:val="center"/>
           </w:tcPr>
           <w:p>
@@ -1254,7 +927,7 @@
         </w:tc>
         <w:tc>
           <w:tcPr>
-            <w:tcW w:w="650" w:type="dxa"/>
+            <w:tcW w:w="1000" w:type="dxa"/>
             <w:vAlign w:val="center"/>
           </w:tcPr>
           <w:p>
@@ -1277,7 +950,7 @@
         </w:tc>
         <w:tc>
           <w:tcPr>
-            <w:tcW w:w="750" w:type="dxa"/>
+            <w:tcW w:w="1150" w:type="dxa"/>
             <w:vAlign w:val="center"/>
           </w:tcPr>
           <w:p>
@@ -1300,7 +973,7 @@
         </w:tc>
         <w:tc>
           <w:tcPr>
-            <w:tcW w:w="1250" w:type="dxa"/>
+            <w:tcW w:w="1450" w:type="dxa"/>
             <w:vAlign w:val="center"/>
           </w:tcPr>
           <w:p>
@@ -1323,7 +996,7 @@
         </w:tc>
         <w:tc>
           <w:tcPr>
-            <w:tcW w:w="1400" w:type="dxa"/>
+            <w:tcW w:w="1650" w:type="dxa"/>
             <w:vAlign w:val="center"/>
           </w:tcPr>
           <w:p>
@@ -1344,75 +1017,6 @@
             </w:r>
           </w:p>
         </w:tc>
-        <w:tc>
-          <w:tcPr>
-            <w:tcW w:w="900" w:type="dxa"/>
-            <w:vAlign w:val="center"/>
-          </w:tcPr>
-          <w:p>
-            <w:pPr>
-              <w:spacing w:before="20" w:after="20" w:line="240" w:lineRule="auto"/>
-              <w:jc w:val="center"/>
-            </w:pPr>
-            <w:r>
-              <w:rPr>
-                <w:rFonts w:ascii="Times New Roman" w:eastAsia="Times New Roman" w:hAnsi="Times New Roman" w:cs="Times New Roman"/>
-                <w:b/>
-                <w:bCs/>
-                <w:sz w:val="20"/>
-                <w:szCs w:val="20"/>
-                <w:lang w:eastAsia="ru-RU"/>
-              </w:rPr>
-              <w:t xml:space="preserve"/>
-            </w:r>
-          </w:p>
-        </w:tc>
-        <w:tc>
-          <w:tcPr>
-            <w:tcW w:w="1100" w:type="dxa"/>
-            <w:vAlign w:val="center"/>
-          </w:tcPr>
-          <w:p>
-            <w:pPr>
-              <w:spacing w:before="20" w:after="20" w:line="240" w:lineRule="auto"/>
-              <w:jc w:val="right"/>
-            </w:pPr>
-            <w:r>
-              <w:rPr>
-                <w:rFonts w:ascii="Times New Roman" w:eastAsia="Times New Roman" w:hAnsi="Times New Roman" w:cs="Times New Roman"/>
-                <w:b/>
-                <w:bCs/>
-                <w:sz w:val="20"/>
-                <w:szCs w:val="20"/>
-                <w:lang w:eastAsia="ru-RU"/>
-              </w:rPr>
-              <w:t xml:space="preserve">8 316 000</w:t>
-            </w:r>
-          </w:p>
-        </w:tc>
-        <w:tc>
-          <w:tcPr>
-            <w:tcW w:w="1150" w:type="dxa"/>
-            <w:vAlign w:val="center"/>
-          </w:tcPr>
-          <w:p>
-            <w:pPr>
-              <w:spacing w:before="20" w:after="20" w:line="240" w:lineRule="auto"/>
-              <w:jc w:val="right"/>
-            </w:pPr>
-            <w:r>
-              <w:rPr>
-                <w:rFonts w:ascii="Times New Roman" w:eastAsia="Times New Roman" w:hAnsi="Times New Roman" w:cs="Times New Roman"/>
-                <w:b/>
-                <w:bCs/>
-                <w:sz w:val="20"/>
-                <w:szCs w:val="20"/>
-                <w:lang w:eastAsia="ru-RU"/>
-              </w:rPr>
-              <w:t xml:space="preserve">77 616 000</w:t>
-            </w:r>
-          </w:p>
-        </w:tc>
       </w:tr>
     </w:tbl>
     <w:p>
@@ -1444,16 +1048,16 @@
           <w:szCs w:val="24"/>
           <w:lang w:eastAsia="ru-RU"/>
         </w:rPr>
-        <w:t xml:space="preserve">77 616 000 (Семьдесят семь миллионов шестьсот шестнадцать тысяч) сум 00 тийин</w:t>
-      </w:r>
-      <w:r>
-        <w:rPr>
-          <w:rFonts w:ascii="Times New Roman" w:eastAsia="Times New Roman" w:hAnsi="Times New Roman" w:cs="Times New Roman"/>
-          <w:sz w:val="24"/>
-          <w:szCs w:val="24"/>
-          <w:lang w:eastAsia="ru-RU"/>
-        </w:rPr>
-        <w:t xml:space="preserve">, с учетом НДС 12%.</w:t>
+        <w:t xml:space="preserve">69 300 000 (Шестьдесят девять миллионов триста тысяч) сум 00 тийин</w:t>
+      </w:r>
+      <w:r>
+        <w:rPr>
+          <w:rFonts w:ascii="Times New Roman" w:eastAsia="Times New Roman" w:hAnsi="Times New Roman" w:cs="Times New Roman"/>
+          <w:sz w:val="24"/>
+          <w:szCs w:val="24"/>
+          <w:lang w:eastAsia="ru-RU"/>
+        </w:rPr>
+        <w:t xml:space="preserve">, без НДС. Поставщик не является плательщиком НДС.</w:t>
       </w:r>
     </w:p>
     <w:p>
@@ -1533,16 +1137,16 @@
           <w:szCs w:val="24"/>
           <w:lang w:eastAsia="ru-RU"/>
         </w:rPr>
-        <w:t xml:space="preserve">77 616 000 сум</w:t>
-      </w:r>
-      <w:r>
-        <w:rPr>
-          <w:rFonts w:ascii="Times New Roman" w:eastAsia="Times New Roman" w:hAnsi="Times New Roman" w:cs="Times New Roman"/>
-          <w:sz w:val="24"/>
-          <w:szCs w:val="24"/>
-          <w:lang w:eastAsia="ru-RU"/>
-        </w:rPr>
-        <w:t xml:space="preserve"> (Семьдесят семь миллионов шестьсот шестнадцать тысяч сумов 00 тийин) с учетом НДС 12%.</w:t>
+        <w:t xml:space="preserve">69 300 000 сум</w:t>
+      </w:r>
+      <w:r>
+        <w:rPr>
+          <w:rFonts w:ascii="Times New Roman" w:eastAsia="Times New Roman" w:hAnsi="Times New Roman" w:cs="Times New Roman"/>
+          <w:sz w:val="24"/>
+          <w:szCs w:val="24"/>
+          <w:lang w:eastAsia="ru-RU"/>
+        </w:rPr>
+        <w:t xml:space="preserve"> (Шестьдесят девять миллионов триста тысяч сумов 00 тийин), без НДС, так как Поставщик не является плательщиком НДС.</w:t>
       </w:r>
     </w:p>
     <w:p>

</xml_diff>